<commit_message>
Align submission materials with public repository and current deployment
</commit_message>
<xml_diff>
--- a/submission/AlphaVault-Individual-Contribution.docx
+++ b/submission/AlphaVault-Individual-Contribution.docx
@@ -1447,7 +1447,7 @@
                 <w:color w:val="000000"/>
                 <w:sz w:val="18"/>
               </w:rPr>
-              <w:t>Current submission revision</w:t>
+              <w:t>32efd3e and subsequent revision</w:t>
             </w:r>
           </w:p>
         </w:tc>
@@ -1478,7 +1478,7 @@
                 <w:color w:val="000000"/>
                 <w:sz w:val="18"/>
               </w:rPr>
-              <w:t>Expanded report and diagrams, ten-minute demonstration, manual and this contribution report; see latest git log</w:t>
+              <w:t>Fourteen-page report, diagrams, ten-minute demo, manual and contribution report; current revision aligns public repository and deployment status</w:t>
             </w:r>
           </w:p>
         </w:tc>
@@ -1526,7 +1526,7 @@
     <w:p>
       <w:pPr/>
       <w:r>
-        <w:t>The source archive excludes credentials, runtime databases and node_modules. The repository is private, so the assessor needs access or the supplied source ZIP. Final presentation and operating readiness should be checked before the assessment; the ten-minute recording provides a reproducible fallback when a live service is sleeping.</w:t>
+        <w:t>The source archive excludes credentials, runtime databases and node_modules. The repository is public, and the source ZIP provides an additional review copy. Final presentation and operating readiness should be checked before the assessment; the ten-minute recording provides a reproducible fallback when a live service is sleeping.</w:t>
       </w:r>
     </w:p>
     <w:sectPr>

</xml_diff>

<commit_message>
Align submission documents and software demo with Flask deployment
</commit_message>
<xml_diff>
--- a/submission/AlphaVault-Individual-Contribution.docx
+++ b/submission/AlphaVault-Individual-Contribution.docx
@@ -7,13 +7,13 @@
         <w:pStyle w:val="Title"/>
       </w:pPr>
       <w:r>
-        <w:t>AlphaVault individual contribution report</w:t>
+        <w:t>AlphaVault Individual Contribution Report</w:t>
       </w:r>
     </w:p>
     <w:p>
       <w:pPr/>
       <w:r>
-        <w:t>Project owner: Du zhuotong | SC6113 | Individual project</w:t>
+        <w:t>Du Zhuotong</w:t>
       </w:r>
     </w:p>
     <w:p>
@@ -330,7 +330,7 @@
                 <w:color w:val="000000"/>
                 <w:sz w:val="18"/>
               </w:rPr>
-              <w:t>contracts/; contract tests; Sepolia manifest</w:t>
+              <w:t>contracts/; test/contracts.test.mjs; config/sepolia-deployment.json</w:t>
             </w:r>
           </w:p>
         </w:tc>
@@ -428,7 +428,7 @@
                 <w:color w:val="000000"/>
                 <w:sz w:val="18"/>
               </w:rPr>
-              <w:t>server/; API.md; persistence evidence</w:t>
+              <w:t>backend/; docs/API.md; evidence/flask-hosted-acceptance.json</w:t>
             </w:r>
           </w:p>
         </w:tc>
@@ -624,7 +624,7 @@
                 <w:color w:val="000000"/>
                 <w:sz w:val="18"/>
               </w:rPr>
-              <w:t>server/quant.mjs; evidence/backtests.json</w:t>
+              <w:t>backend/quant.py; evidence/backtests.json</w:t>
             </w:r>
           </w:p>
         </w:tc>
@@ -722,7 +722,7 @@
                 <w:color w:val="000000"/>
                 <w:sz w:val="18"/>
               </w:rPr>
-              <w:t>submission-tests.tap; SEPOLIA_RESULTS.md; hosted evidence</w:t>
+              <w:t>evidence/current-tests.tap; docs/SEPOLIA_RESULTS.md; hosted acceptance</w:t>
             </w:r>
           </w:p>
         </w:tc>
@@ -820,7 +820,7 @@
                 <w:color w:val="000000"/>
                 <w:sz w:val="18"/>
               </w:rPr>
-              <w:t>submission/; SUBMISSION_MAP.md</w:t>
+              <w:t>submission/; docs/SUBMISSION_MAP.md; compact submission ZIP</w:t>
             </w:r>
           </w:p>
         </w:tc>
@@ -867,7 +867,7 @@
     <w:p>
       <w:pPr/>
       <w:r>
-        <w:t>The Git history below records meaningful saved checkpoints. The initial implementation is a bundled commit; these timestamps are not a complete timesheet or proof of when each line was written. Subsequent commits document hosting fixes, acceptance evidence and submission revisions. The repository’s full git log remains the authoritative history.</w:t>
+        <w:t>Git records the saved implementation, hosting and submission checkpoints below. The initial implementation is a bundled commit; commit timestamps are not a development timesheet. The repository retains the full history.</w:t>
       </w:r>
     </w:p>
     <w:tbl>
@@ -1447,7 +1447,7 @@
                 <w:color w:val="000000"/>
                 <w:sz w:val="18"/>
               </w:rPr>
-              <w:t>32efd3e and subsequent revision</w:t>
+              <w:t>32efd3e</w:t>
             </w:r>
           </w:p>
         </w:tc>
@@ -1478,7 +1478,74 @@
                 <w:color w:val="000000"/>
                 <w:sz w:val="18"/>
               </w:rPr>
-              <w:t>Fourteen-page report, diagrams, ten-minute demo, manual and contribution report; current revision aligns public repository and deployment status</w:t>
+              <w:t>Fourteen-page report, diagrams, ten-minute demo, manual and contribution report</w:t>
+            </w:r>
+          </w:p>
+        </w:tc>
+      </w:tr>
+      <w:tr>
+        <w:trPr>
+          <w:cantSplit/>
+        </w:trPr>
+        <w:tc>
+          <w:tcPr>
+            <w:tcW w:type="dxa" w:w="4680"/>
+            <w:shd w:fill="FFFFFF"/>
+            <w:tcBorders>
+              <w:top w:val="single" w:sz="4" w:color="D9D9D9"/>
+              <w:left w:val="single" w:sz="4" w:color="D9D9D9"/>
+              <w:bottom w:val="single" w:sz="4" w:color="D9D9D9"/>
+              <w:right w:val="single" w:sz="4" w:color="D9D9D9"/>
+            </w:tcBorders>
+            <w:tcMar>
+              <w:top w:w="85" w:type="dxa"/>
+              <w:left w:w="85" w:type="dxa"/>
+              <w:bottom w:w="85" w:type="dxa"/>
+              <w:right w:w="85" w:type="dxa"/>
+            </w:tcMar>
+          </w:tcPr>
+          <w:p>
+            <w:pPr>
+              <w:spacing w:after="60" w:line="250" w:lineRule="auto"/>
+            </w:pPr>
+            <w:r>
+              <w:rPr>
+                <w:b w:val="0"/>
+                <w:color w:val="000000"/>
+                <w:sz w:val="18"/>
+              </w:rPr>
+              <w:t>9439d16</w:t>
+            </w:r>
+          </w:p>
+        </w:tc>
+        <w:tc>
+          <w:tcPr>
+            <w:tcW w:type="dxa" w:w="4680"/>
+            <w:shd w:fill="FFFFFF"/>
+            <w:tcBorders>
+              <w:top w:val="single" w:sz="4" w:color="D9D9D9"/>
+              <w:left w:val="single" w:sz="4" w:color="D9D9D9"/>
+              <w:bottom w:val="single" w:sz="4" w:color="D9D9D9"/>
+              <w:right w:val="single" w:sz="4" w:color="D9D9D9"/>
+            </w:tcBorders>
+            <w:tcMar>
+              <w:top w:w="85" w:type="dxa"/>
+              <w:left w:w="85" w:type="dxa"/>
+              <w:bottom w:w="85" w:type="dxa"/>
+              <w:right w:w="85" w:type="dxa"/>
+            </w:tcMar>
+          </w:tcPr>
+          <w:p>
+            <w:pPr>
+              <w:spacing w:after="60" w:line="250" w:lineRule="auto"/>
+            </w:pPr>
+            <w:r>
+              <w:rPr>
+                <w:b w:val="0"/>
+                <w:color w:val="000000"/>
+                <w:sz w:val="18"/>
+              </w:rPr>
+              <w:t>Python Flask API, standalone ABI and 36 integration tests</w:t>
             </w:r>
           </w:p>
         </w:tc>
@@ -1500,13 +1567,13 @@
     <w:p>
       <w:pPr/>
       <w:r>
-        <w:t>The latest full automated run passed 64 tests with zero failures. Contract scenarios cover role enforcement, risk caps, execution rollback, stale prices, paused exit and share accounting. API/storage scenarios cover indexing, receipt validation, unsigned preparation, persistence and public signing isolation. The public acceptance check passed wallet mode, PostgreSQL, Sepolia deployment binding and ten verified transaction types. The earlier non-chain sentinel retained across a service restart remains the evidence for durable database storage.</w:t>
+        <w:t>Validation passes 36 Flask tests and 64 Solidity/legacy regression tests. The Python suite covers all 13 business methods, role and request guards, indexing, canonical receipts, rollback, SQLite persistence and quantitative parity. Logs are evidence/flask-tests.txt and evidence/flask-migration-node-regression.tap. Public acceptance verifies the Flask service, PostgreSQL and the unchanged Sepolia deployment. Existing public evidence contains 12 successful receipts across 10 method types, including ERC20 approve. No new public transaction is needed for the backend migration.</w:t>
       </w:r>
     </w:p>
     <w:p>
       <w:pPr/>
       <w:r>
-        <w:t>Three separate wallets were used for the investor/admin/Keeper, manager and risk officer roles. Saved Sepolia receipts show deposit, strategy/policy updates, rebalance, pause, in-kind redemption and resume. The public Keeper transaction was manually signed; an unattended Keeper was demonstrated locally. The new submission work does not claim additional public signatures.</w:t>
+        <w:t>Three separate wallets were used for the investor/admin/Keeper, manager and risk officer roles. Saved Sepolia receipts show deposit, strategy/policy updates, rebalance, pause, in-kind redemption and resume. The public Keeper transaction was manually signed; the local Keeper tick was tested for execution and cooldown skipping. No unattended cloud Keeper is claimed.</w:t>
       </w:r>
     </w:p>
     <w:p>
@@ -1526,12 +1593,11 @@
     <w:p>
       <w:pPr/>
       <w:r>
-        <w:t>The source archive excludes credentials, runtime databases and node_modules. The repository is public, and the source ZIP provides an additional review copy. Final presentation and operating readiness should be checked before the assessment; the ten-minute recording provides a reproducible fallback when a live service is sleeping.</w:t>
+        <w:t>The submission includes the report, five diagrams, slides, ten-minute software video, user manual and contribution report. Its Source-Code folder directly contains Solidity, standalone ABI, Python Flask, HTML, CSS and JavaScript files, dependencies, tests and setup instructions. The Render URL and GitHub link are included. Credentials, runtime databases and node_modules are excluded.</w:t>
       </w:r>
     </w:p>
     <w:sectPr>
-      <w:headerReference w:type="default" r:id="rId9"/>
-      <w:footerReference w:type="default" r:id="rId10"/>
+      <w:footerReference w:type="default" r:id="rId9"/>
       <w:pgSz w:w="11909" w:h="16834"/>
       <w:pgMar w:top="936" w:right="1037" w:bottom="936" w:left="1037" w:header="720" w:footer="720" w:gutter="0"/>
       <w:cols w:space="720"/>
@@ -1551,22 +1617,6 @@
     <w:fldSimple w:instr="PAGE"/>
   </w:p>
 </w:ftr>
-</file>
-
-<file path=word/header1.xml><?xml version="1.0" encoding="utf-8"?>
-<w:hdr xmlns:m="http://schemas.openxmlformats.org/officeDocument/2006/math" xmlns:mc="http://schemas.openxmlformats.org/markup-compatibility/2006" xmlns:mo="http://schemas.microsoft.com/office/mac/office/2008/main" xmlns:mv="urn:schemas-microsoft-com:mac:vml" xmlns:o="urn:schemas-microsoft-com:office:office" xmlns:r="http://schemas.openxmlformats.org/officeDocument/2006/relationships" xmlns:v="urn:schemas-microsoft-com:vml" xmlns:w10="urn:schemas-microsoft-com:office:word" xmlns:w14="http://schemas.microsoft.com/office/word/2010/wordml" xmlns:w="http://schemas.openxmlformats.org/wordprocessingml/2006/main" xmlns:wne="http://schemas.microsoft.com/office/word/2006/wordml" xmlns:wp14="http://schemas.microsoft.com/office/word/2010/wordprocessingDrawing" xmlns:wp="http://schemas.openxmlformats.org/drawingml/2006/wordprocessingDrawing" xmlns:wpc="http://schemas.microsoft.com/office/word/2010/wordprocessingCanvas" xmlns:wpg="http://schemas.microsoft.com/office/word/2010/wordprocessingGroup" xmlns:wpi="http://schemas.microsoft.com/office/word/2010/wordprocessingInk" xmlns:wps="http://schemas.microsoft.com/office/word/2010/wordprocessingShape" mc:Ignorable="w14 wp14">
-  <w:p>
-    <w:pPr>
-      <w:pStyle w:val="Header"/>
-    </w:pPr>
-    <w:r>
-      <w:rPr>
-        <w:sz w:val="16"/>
-      </w:rPr>
-      <w:t>AlphaVault    SC6113</w:t>
-    </w:r>
-  </w:p>
-</w:hdr>
 </file>
 
 <file path=word/numbering.xml><?xml version="1.0" encoding="utf-8"?>

</xml_diff>